<commit_message>
Harden review DOCX generation
</commit_message>
<xml_diff>
--- a/shared/templates/reviews/combined-review-v1.docx
+++ b/shared/templates/reviews/combined-review-v1.docx
@@ -223,7 +223,7 @@
         <w:color w:val="666666"/>
         <w:sz w:val="18"/>
       </w:rPr>
-      <w:t>Generated September 2, 2026</w:t>
+      <w:t>[[WMKF:GENERATED]]</w:t>
     </w:r>
   </w:p>
 </w:ftr>
@@ -263,7 +263,7 @@
         <w:b w:val="0"/>
         <w:sz w:val="20"/>
       </w:rPr>
-      <w:t>W. M. Keck Foundation – Research Program – Combined Review</w:t>
+      <w:t>W. M. Keck Foundation – Research Program – Aggregated Proposal Reviews</w:t>
     </w:r>
   </w:p>
   <w:p>

</xml_diff>